<commit_message>
Add POS maintenance and AI-assisted development to experience
Add a bullet on POS support/bug-fix work and one on using Claude Code
across project planning, issue triage, and release management, plus a
new AI-Assisted Development skills group. Regenerate resume docx/pdf.

Co-Authored-By: Claude Opus 4.8 <noreply@anthropic.com>
</commit_message>
<xml_diff>
--- a/public/assets/JosephBall_Resume.docx
+++ b/public/assets/JosephBall_Resume.docx
@@ -381,6 +381,44 @@
           <w:szCs w:val="19"/>
         </w:rPr>
         <w:t xml:space="preserve">Integrated applications with SQL Server and Azure SQL databases; designed schemas supporting data validation, audit tracking, and multi-year transactional history.</w:t>
+      </w:r>
+    </w:p>
+    <w:p>
+      <w:pPr>
+        <w:pStyle w:val="ListParagraph"/>
+        <w:numPr>
+          <w:ilvl w:val="0"/>
+          <w:numId w:val="2"/>
+        </w:numPr>
+        <w:spacing w:after="20" w:before="20"/>
+      </w:pPr>
+      <w:r>
+        <w:rPr>
+          <w:rFonts w:ascii="Arial" w:cs="Arial" w:eastAsia="Arial" w:hAnsi="Arial"/>
+          <w:color w:val="444444"/>
+          <w:sz w:val="19"/>
+          <w:szCs w:val="19"/>
+        </w:rPr>
+        <w:t xml:space="preserve">Fielded support calls and maintained the company’s primary point-of-sale codebase, diagnosing and resolving minor bugs to keep client systems running smoothly.</w:t>
+      </w:r>
+    </w:p>
+    <w:p>
+      <w:pPr>
+        <w:pStyle w:val="ListParagraph"/>
+        <w:numPr>
+          <w:ilvl w:val="0"/>
+          <w:numId w:val="2"/>
+        </w:numPr>
+        <w:spacing w:after="20" w:before="20"/>
+      </w:pPr>
+      <w:r>
+        <w:rPr>
+          <w:rFonts w:ascii="Arial" w:cs="Arial" w:eastAsia="Arial" w:hAnsi="Arial"/>
+          <w:color w:val="444444"/>
+          <w:sz w:val="19"/>
+          <w:szCs w:val="19"/>
+        </w:rPr>
+        <w:t xml:space="preserve">Manage project planning, issue triage, and release coordination across both production systems, using Claude Code as an integrated part of the workflow to keep development organized and moving efficiently.</w:t>
       </w:r>
     </w:p>
     <w:p>
@@ -898,6 +936,66 @@
           </w:p>
         </w:tc>
       </w:tr>
+      <w:tr>
+        <w:tc>
+          <w:tcPr>
+            <w:tcW w:type="dxa" w:w="2100"/>
+            <w:tcBorders>
+              <w:top w:val="none" w:color="FFFFFF" w:sz="0"/>
+              <w:left w:val="none" w:color="FFFFFF" w:sz="0"/>
+              <w:bottom w:val="none" w:color="FFFFFF" w:sz="0"/>
+              <w:right w:val="none" w:color="FFFFFF" w:sz="0"/>
+            </w:tcBorders>
+            <w:tcMar>
+              <w:top w:type="dxa" w:w="30"/>
+              <w:left w:type="dxa" w:w="0"/>
+              <w:bottom w:type="dxa" w:w="30"/>
+              <w:right w:type="dxa" w:w="80"/>
+            </w:tcMar>
+          </w:tcPr>
+          <w:p>
+            <w:r>
+              <w:rPr>
+                <w:rFonts w:ascii="Arial" w:cs="Arial" w:eastAsia="Arial" w:hAnsi="Arial"/>
+                <w:b/>
+                <w:bCs/>
+                <w:color w:val="1A1A2E"/>
+                <w:sz w:val="19"/>
+                <w:szCs w:val="19"/>
+              </w:rPr>
+              <w:t xml:space="preserve">AI-Assisted Development:</w:t>
+            </w:r>
+          </w:p>
+        </w:tc>
+        <w:tc>
+          <w:tcPr>
+            <w:tcW w:type="dxa" w:w="8268"/>
+            <w:tcBorders>
+              <w:top w:val="none" w:color="FFFFFF" w:sz="0"/>
+              <w:left w:val="none" w:color="FFFFFF" w:sz="0"/>
+              <w:bottom w:val="none" w:color="FFFFFF" w:sz="0"/>
+              <w:right w:val="none" w:color="FFFFFF" w:sz="0"/>
+            </w:tcBorders>
+            <w:tcMar>
+              <w:top w:type="dxa" w:w="30"/>
+              <w:left w:type="dxa" w:w="80"/>
+              <w:bottom w:type="dxa" w:w="30"/>
+              <w:right w:type="dxa" w:w="0"/>
+            </w:tcMar>
+          </w:tcPr>
+          <w:p>
+            <w:r>
+              <w:rPr>
+                <w:rFonts w:ascii="Arial" w:cs="Arial" w:eastAsia="Arial" w:hAnsi="Arial"/>
+                <w:color w:val="444444"/>
+                <w:sz w:val="19"/>
+                <w:szCs w:val="19"/>
+              </w:rPr>
+              <w:t xml:space="preserve">Claude Code — project planning, issue triage, release management</w:t>
+            </w:r>
+          </w:p>
+        </w:tc>
+      </w:tr>
     </w:tbl>
     <w:p>
       <w:pPr>

</xml_diff>